<commit_message>
content: update CV with real data from PDF, add photo, regenerate downloads
</commit_message>
<xml_diff>
--- a/public/downloads/cv.docx
+++ b/public/downloads/cv.docx
@@ -16,26 +16,68 @@
         <w:pStyle w:val="FirstParagraph"/>
       </w:pPr>
       <w:r>
-        <w:t xml:space="preserve">Software Engineer with experience in building web applications and distributed systems. Passionate about clean code, performance, and developer experience.</w:t>
+        <w:rPr>
+          <w:b/>
+          <w:bCs/>
+        </w:rPr>
+        <w:t xml:space="preserve">Frontend Engineer</w:t>
+      </w:r>
+      <w:r>
+        <w:t xml:space="preserve"> </w:t>
+      </w:r>
+      <w:r>
+        <w:t xml:space="preserve">· Kyiv, Ukraine</w:t>
+      </w:r>
+    </w:p>
+    <w:p>
+      <w:pPr>
+        <w:pStyle w:val="BodyText"/>
+      </w:pPr>
+      <w:r>
+        <w:t xml:space="preserve">Self-taught software engineer who is passionate about Tech and coding. I enjoy making my life easier by optimizing and automating processes.</w:t>
+      </w:r>
+    </w:p>
+    <w:p>
+      <w:pPr>
+        <w:pStyle w:val="BodyText"/>
+      </w:pPr>
+      <w:r>
+        <w:t xml:space="preserve">I am disciplined, organized, have solid communication skills and a great ability to learn. I thrive when I have new, complex and non-trivial problems to solve in a creative way, as those make my brain tickle and release dopamine.</w:t>
+      </w:r>
+    </w:p>
+    <w:p>
+      <w:pPr>
+        <w:pStyle w:val="BodyText"/>
+      </w:pPr>
+      <w:r>
+        <w:t xml:space="preserve">Always eager to learn something new and expand my toolkit. Would like to work on both front-end and back-end in the future and learn new programming languages and technologies.</w:t>
+      </w:r>
+    </w:p>
+    <w:p>
+      <w:pPr>
+        <w:pStyle w:val="BodyText"/>
+      </w:pPr>
+      <w:r>
+        <w:t xml:space="preserve">Looking forward to working with passionate and creative folks.</w:t>
       </w:r>
     </w:p>
     <w:bookmarkEnd w:id="9"/>
-    <w:bookmarkStart w:id="12" w:name="work-experience"/>
+    <w:bookmarkStart w:id="13" w:name="employment-history"/>
     <w:p>
       <w:pPr>
         <w:pStyle w:val="Heading2"/>
       </w:pPr>
       <w:r>
-        <w:t xml:space="preserve">Work Experience</w:t>
-      </w:r>
-    </w:p>
-    <w:bookmarkStart w:id="10" w:name="senior-software-engineer-company-name"/>
+        <w:t xml:space="preserve">Employment History</w:t>
+      </w:r>
+    </w:p>
+    <w:bookmarkStart w:id="10" w:name="frontend-engineer-dataart"/>
     <w:p>
       <w:pPr>
         <w:pStyle w:val="Heading3"/>
       </w:pPr>
       <w:r>
-        <w:t xml:space="preserve">Senior Software Engineer — Company Name</w:t>
+        <w:t xml:space="preserve">Frontend Engineer — DataArt</w:t>
       </w:r>
     </w:p>
     <w:p>
@@ -47,7 +89,23 @@
           <w:i/>
           <w:iCs/>
         </w:rPr>
-        <w:t xml:space="preserve">2022 – Present</w:t>
+        <w:t xml:space="preserve">April 2019 — Present</w:t>
+      </w:r>
+    </w:p>
+    <w:p>
+      <w:pPr>
+        <w:pStyle w:val="BodyText"/>
+      </w:pPr>
+      <w:r>
+        <w:t xml:space="preserve">DataArt is a global enterprise software development company. I have been working there as a frontend engineer for more than five years and during this time participated in developing a number of products in different spheres, including publishing, musical industry and insurance, and had experience with different tech stacks.</w:t>
+      </w:r>
+    </w:p>
+    <w:p>
+      <w:pPr>
+        <w:pStyle w:val="BodyText"/>
+      </w:pPr>
+      <w:r>
+        <w:t xml:space="preserve">Among other things, I would like to highlight the following ones:</w:t>
       </w:r>
     </w:p>
     <w:p>
@@ -59,7 +117,7 @@
         </w:numPr>
       </w:pPr>
       <w:r>
-        <w:t xml:space="preserve">Built and maintained web applications using modern frameworks</w:t>
+        <w:t xml:space="preserve">Built complex UI</w:t>
       </w:r>
     </w:p>
     <w:p>
@@ -71,7 +129,7 @@
         </w:numPr>
       </w:pPr>
       <w:r>
-        <w:t xml:space="preserve">Led technical architecture decisions for new projects</w:t>
+        <w:t xml:space="preserve">Participated in building a robust publishing system based on Next.js and WordPress and integrating VOD and live streaming features using JW Player</w:t>
       </w:r>
     </w:p>
     <w:p>
@@ -83,17 +141,53 @@
         </w:numPr>
       </w:pPr>
       <w:r>
-        <w:t xml:space="preserve">Mentored junior developers</w:t>
+        <w:t xml:space="preserve">Took part in creating a custom testing framework based on Cypress for testing analytics. I created a solution that automated mocks gathering that used to be done manually before that and consumed a lot of time and efforts</w:t>
+      </w:r>
+    </w:p>
+    <w:p>
+      <w:pPr>
+        <w:pStyle w:val="Compact"/>
+        <w:numPr>
+          <w:ilvl w:val="0"/>
+          <w:numId w:val="1001"/>
+        </w:numPr>
+      </w:pPr>
+      <w:r>
+        <w:t xml:space="preserve">Performed a significant optimization of a Next.js application, reducing its JavaScript bundle size by 60%, cutting off unused CSS, helping DevOps team integrating CDN for static assets, integrating Redis for caching API calls</w:t>
+      </w:r>
+    </w:p>
+    <w:p>
+      <w:pPr>
+        <w:pStyle w:val="Compact"/>
+        <w:numPr>
+          <w:ilvl w:val="0"/>
+          <w:numId w:val="1001"/>
+        </w:numPr>
+      </w:pPr>
+      <w:r>
+        <w:t xml:space="preserve">Integrated a number of 3rd party services, including payment providers</w:t>
+      </w:r>
+    </w:p>
+    <w:p>
+      <w:pPr>
+        <w:pStyle w:val="Compact"/>
+        <w:numPr>
+          <w:ilvl w:val="0"/>
+          <w:numId w:val="1001"/>
+        </w:numPr>
+      </w:pPr>
+      <w:r>
+        <w:t xml:space="preserve">Helped my colleagues with preparation for client interviews</w:t>
       </w:r>
     </w:p>
     <w:bookmarkEnd w:id="10"/>
-    <w:bookmarkStart w:id="11" w:name="software-engineer-previous-company"/>
+    <w:bookmarkStart w:id="11" w:name="customer-support-specialist-cloudbeds"/>
     <w:p>
       <w:pPr>
         <w:pStyle w:val="Heading3"/>
       </w:pPr>
       <w:r>
-        <w:t xml:space="preserve">Software Engineer — Previous Company</w:t>
+        <w:t xml:space="preserve">Customer Support Specialist — Cloudbeds</w:t>
       </w:r>
     </w:p>
     <w:p>
@@ -105,7 +199,128 @@
           <w:i/>
           <w:iCs/>
         </w:rPr>
-        <w:t xml:space="preserve">2019 – 2022</w:t>
+        <w:t xml:space="preserve">February 2018 — November 2018</w:t>
+      </w:r>
+    </w:p>
+    <w:p>
+      <w:pPr>
+        <w:pStyle w:val="BodyText"/>
+      </w:pPr>
+      <w:r>
+        <w:t xml:space="preserve">Cloudbeds is a software company building hospitality management solutions. My role there was to provide customer support to users over phone calls and email correspondence.</w:t>
+      </w:r>
+    </w:p>
+    <w:bookmarkEnd w:id="11"/>
+    <w:bookmarkStart w:id="12" w:name="customer-support-specialist-namecheap"/>
+    <w:p>
+      <w:pPr>
+        <w:pStyle w:val="Heading3"/>
+      </w:pPr>
+      <w:r>
+        <w:t xml:space="preserve">Customer Support Specialist — Namecheap</w:t>
+      </w:r>
+    </w:p>
+    <w:p>
+      <w:pPr>
+        <w:pStyle w:val="FirstParagraph"/>
+      </w:pPr>
+      <w:r>
+        <w:rPr>
+          <w:i/>
+          <w:iCs/>
+        </w:rPr>
+        <w:t xml:space="preserve">January 2015 — October 2017</w:t>
+      </w:r>
+    </w:p>
+    <w:p>
+      <w:pPr>
+        <w:pStyle w:val="BodyText"/>
+      </w:pPr>
+      <w:r>
+        <w:t xml:space="preserve">Namecheap is an American ICANN-accredited domain name registrar and web hosting company. My job there was to provide top-notch customer support over chats, email correspondence and phone calls to clients all over the world.</w:t>
+      </w:r>
+    </w:p>
+    <w:bookmarkEnd w:id="12"/>
+    <w:bookmarkEnd w:id="13"/>
+    <w:bookmarkStart w:id="15" w:name="education"/>
+    <w:p>
+      <w:pPr>
+        <w:pStyle w:val="Heading2"/>
+      </w:pPr>
+      <w:r>
+        <w:t xml:space="preserve">Education</w:t>
+      </w:r>
+    </w:p>
+    <w:bookmarkStart w:id="14" w:name="Xd23a71c5b66bafc286a57045e13c8548312ea6e"/>
+    <w:p>
+      <w:pPr>
+        <w:pStyle w:val="Heading3"/>
+      </w:pPr>
+      <w:r>
+        <w:t xml:space="preserve">Master’s Degree — V.N.Karazin Kharkiv National University, Kharkiv</w:t>
+      </w:r>
+    </w:p>
+    <w:p>
+      <w:pPr>
+        <w:pStyle w:val="FirstParagraph"/>
+      </w:pPr>
+      <w:r>
+        <w:rPr>
+          <w:i/>
+          <w:iCs/>
+        </w:rPr>
+        <w:t xml:space="preserve">September 2012 — February 2018</w:t>
+      </w:r>
+    </w:p>
+    <w:p>
+      <w:pPr>
+        <w:pStyle w:val="BodyText"/>
+      </w:pPr>
+      <w:r>
+        <w:t xml:space="preserve">Faculty of Foreign Languages</w:t>
+      </w:r>
+    </w:p>
+    <w:bookmarkEnd w:id="14"/>
+    <w:bookmarkEnd w:id="15"/>
+    <w:bookmarkStart w:id="17" w:name="courses"/>
+    <w:p>
+      <w:pPr>
+        <w:pStyle w:val="Heading2"/>
+      </w:pPr>
+      <w:r>
+        <w:t xml:space="preserve">Courses</w:t>
+      </w:r>
+    </w:p>
+    <w:bookmarkStart w:id="16" w:name="algorithms-projector"/>
+    <w:p>
+      <w:pPr>
+        <w:pStyle w:val="Heading3"/>
+      </w:pPr>
+      <w:r>
+        <w:t xml:space="preserve">Algorithms — Projector</w:t>
+      </w:r>
+    </w:p>
+    <w:p>
+      <w:pPr>
+        <w:pStyle w:val="FirstParagraph"/>
+      </w:pPr>
+      <w:r>
+        <w:rPr>
+          <w:i/>
+          <w:iCs/>
+        </w:rPr>
+        <w:t xml:space="preserve">March 2022 — June 2022</w:t>
+      </w:r>
+    </w:p>
+    <w:bookmarkEnd w:id="16"/>
+    <w:bookmarkEnd w:id="17"/>
+    <w:bookmarkStart w:id="18" w:name="technical-skills"/>
+    <w:p>
+      <w:pPr>
+        <w:pStyle w:val="Heading2"/>
+      </w:pPr>
+      <w:r>
+        <w:t xml:space="preserve">Technical Skills</w:t>
       </w:r>
     </w:p>
     <w:p>
@@ -117,7 +332,17 @@
         </w:numPr>
       </w:pPr>
       <w:r>
-        <w:t xml:space="preserve">Developed REST APIs and microservices</w:t>
+        <w:rPr>
+          <w:b/>
+          <w:bCs/>
+        </w:rPr>
+        <w:t xml:space="preserve">Languages:</w:t>
+      </w:r>
+      <w:r>
+        <w:t xml:space="preserve"> </w:t>
+      </w:r>
+      <w:r>
+        <w:t xml:space="preserve">JavaScript, TypeScript, Python</w:t>
       </w:r>
     </w:p>
     <w:p>
@@ -129,7 +354,17 @@
         </w:numPr>
       </w:pPr>
       <w:r>
-        <w:t xml:space="preserve">Implemented CI/CD pipelines</w:t>
+        <w:rPr>
+          <w:b/>
+          <w:bCs/>
+        </w:rPr>
+        <w:t xml:space="preserve">Frontend:</w:t>
+      </w:r>
+      <w:r>
+        <w:t xml:space="preserve"> </w:t>
+      </w:r>
+      <w:r>
+        <w:t xml:space="preserve">React, Next.js, HTML &amp; CSS, SCSS, CSS-in-JS</w:t>
       </w:r>
     </w:p>
     <w:p>
@@ -141,58 +376,203 @@
         </w:numPr>
       </w:pPr>
       <w:r>
-        <w:t xml:space="preserve">Collaborated with cross-functional teams</w:t>
-      </w:r>
-    </w:p>
-    <w:bookmarkEnd w:id="11"/>
-    <w:bookmarkEnd w:id="12"/>
-    <w:bookmarkStart w:id="14" w:name="education"/>
+        <w:rPr>
+          <w:b/>
+          <w:bCs/>
+        </w:rPr>
+        <w:t xml:space="preserve">State Management:</w:t>
+      </w:r>
+      <w:r>
+        <w:t xml:space="preserve"> </w:t>
+      </w:r>
+      <w:r>
+        <w:t xml:space="preserve">Redux, Zustand, RxJS</w:t>
+      </w:r>
+    </w:p>
+    <w:p>
+      <w:pPr>
+        <w:pStyle w:val="Compact"/>
+        <w:numPr>
+          <w:ilvl w:val="0"/>
+          <w:numId w:val="1002"/>
+        </w:numPr>
+      </w:pPr>
+      <w:r>
+        <w:rPr>
+          <w:b/>
+          <w:bCs/>
+        </w:rPr>
+        <w:t xml:space="preserve">Backend:</w:t>
+      </w:r>
+      <w:r>
+        <w:t xml:space="preserve"> </w:t>
+      </w:r>
+      <w:r>
+        <w:t xml:space="preserve">Node.js, REST API</w:t>
+      </w:r>
+    </w:p>
+    <w:p>
+      <w:pPr>
+        <w:pStyle w:val="Compact"/>
+        <w:numPr>
+          <w:ilvl w:val="0"/>
+          <w:numId w:val="1002"/>
+        </w:numPr>
+      </w:pPr>
+      <w:r>
+        <w:rPr>
+          <w:b/>
+          <w:bCs/>
+        </w:rPr>
+        <w:t xml:space="preserve">Databases:</w:t>
+      </w:r>
+      <w:r>
+        <w:t xml:space="preserve"> </w:t>
+      </w:r>
+      <w:r>
+        <w:t xml:space="preserve">MongoDB, PostgreSQL, Redis</w:t>
+      </w:r>
+    </w:p>
+    <w:p>
+      <w:pPr>
+        <w:pStyle w:val="Compact"/>
+        <w:numPr>
+          <w:ilvl w:val="0"/>
+          <w:numId w:val="1002"/>
+        </w:numPr>
+      </w:pPr>
+      <w:r>
+        <w:rPr>
+          <w:b/>
+          <w:bCs/>
+        </w:rPr>
+        <w:t xml:space="preserve">Testing:</w:t>
+      </w:r>
+      <w:r>
+        <w:t xml:space="preserve"> </w:t>
+      </w:r>
+      <w:r>
+        <w:t xml:space="preserve">Cypress</w:t>
+      </w:r>
+    </w:p>
+    <w:p>
+      <w:pPr>
+        <w:pStyle w:val="Compact"/>
+        <w:numPr>
+          <w:ilvl w:val="0"/>
+          <w:numId w:val="1002"/>
+        </w:numPr>
+      </w:pPr>
+      <w:r>
+        <w:rPr>
+          <w:b/>
+          <w:bCs/>
+        </w:rPr>
+        <w:t xml:space="preserve">Build Tools:</w:t>
+      </w:r>
+      <w:r>
+        <w:t xml:space="preserve"> </w:t>
+      </w:r>
+      <w:r>
+        <w:t xml:space="preserve">Webpack</w:t>
+      </w:r>
+    </w:p>
+    <w:p>
+      <w:pPr>
+        <w:pStyle w:val="Compact"/>
+        <w:numPr>
+          <w:ilvl w:val="0"/>
+          <w:numId w:val="1002"/>
+        </w:numPr>
+      </w:pPr>
+      <w:r>
+        <w:rPr>
+          <w:b/>
+          <w:bCs/>
+        </w:rPr>
+        <w:t xml:space="preserve">UI Libraries:</w:t>
+      </w:r>
+      <w:r>
+        <w:t xml:space="preserve"> </w:t>
+      </w:r>
+      <w:r>
+        <w:t xml:space="preserve">Material UI, Ant Design</w:t>
+      </w:r>
+    </w:p>
+    <w:p>
+      <w:pPr>
+        <w:pStyle w:val="Compact"/>
+        <w:numPr>
+          <w:ilvl w:val="0"/>
+          <w:numId w:val="1002"/>
+        </w:numPr>
+      </w:pPr>
+      <w:r>
+        <w:rPr>
+          <w:b/>
+          <w:bCs/>
+        </w:rPr>
+        <w:t xml:space="preserve">Design:</w:t>
+      </w:r>
+      <w:r>
+        <w:t xml:space="preserve"> </w:t>
+      </w:r>
+      <w:r>
+        <w:t xml:space="preserve">Figma</w:t>
+      </w:r>
+    </w:p>
+    <w:p>
+      <w:pPr>
+        <w:pStyle w:val="Compact"/>
+        <w:numPr>
+          <w:ilvl w:val="0"/>
+          <w:numId w:val="1002"/>
+        </w:numPr>
+      </w:pPr>
+      <w:r>
+        <w:rPr>
+          <w:b/>
+          <w:bCs/>
+        </w:rPr>
+        <w:t xml:space="preserve">Principles:</w:t>
+      </w:r>
+      <w:r>
+        <w:t xml:space="preserve"> </w:t>
+      </w:r>
+      <w:r>
+        <w:t xml:space="preserve">SOLID, GRASP</w:t>
+      </w:r>
+    </w:p>
+    <w:p>
+      <w:pPr>
+        <w:pStyle w:val="Compact"/>
+        <w:numPr>
+          <w:ilvl w:val="0"/>
+          <w:numId w:val="1002"/>
+        </w:numPr>
+      </w:pPr>
+      <w:r>
+        <w:rPr>
+          <w:b/>
+          <w:bCs/>
+        </w:rPr>
+        <w:t xml:space="preserve">Version Control:</w:t>
+      </w:r>
+      <w:r>
+        <w:t xml:space="preserve"> </w:t>
+      </w:r>
+      <w:r>
+        <w:t xml:space="preserve">Git</w:t>
+      </w:r>
+    </w:p>
+    <w:bookmarkEnd w:id="18"/>
+    <w:bookmarkStart w:id="19" w:name="languages"/>
     <w:p>
       <w:pPr>
         <w:pStyle w:val="Heading2"/>
       </w:pPr>
       <w:r>
-        <w:t xml:space="preserve">Education</w:t>
-      </w:r>
-    </w:p>
-    <w:bookmarkStart w:id="13" w:name="bachelor-of-computer-science"/>
-    <w:p>
-      <w:pPr>
-        <w:pStyle w:val="Heading3"/>
-      </w:pPr>
-      <w:r>
-        <w:t xml:space="preserve">Bachelor of Computer Science</w:t>
-      </w:r>
-    </w:p>
-    <w:p>
-      <w:pPr>
-        <w:pStyle w:val="FirstParagraph"/>
-      </w:pPr>
-      <w:r>
-        <w:rPr>
-          <w:i/>
-          <w:iCs/>
-        </w:rPr>
-        <w:t xml:space="preserve">University Name, 2015 – 2019</w:t>
-      </w:r>
-    </w:p>
-    <w:p>
-      <w:pPr>
-        <w:pStyle w:val="BodyText"/>
-      </w:pPr>
-      <w:r>
-        <w:t xml:space="preserve">Focused on software engineering, algorithms, and distributed systems.</w:t>
-      </w:r>
-    </w:p>
-    <w:bookmarkEnd w:id="13"/>
-    <w:bookmarkEnd w:id="14"/>
-    <w:bookmarkStart w:id="15" w:name="technical-skills"/>
-    <w:p>
-      <w:pPr>
-        <w:pStyle w:val="Heading2"/>
-      </w:pPr>
-      <w:r>
-        <w:t xml:space="preserve">Technical Skills</w:t>
+        <w:t xml:space="preserve">Languages</w:t>
       </w:r>
     </w:p>
     <w:p>
@@ -208,13 +588,13 @@
           <w:b/>
           <w:bCs/>
         </w:rPr>
-        <w:t xml:space="preserve">Languages:</w:t>
+        <w:t xml:space="preserve">Ukrainian</w:t>
       </w:r>
       <w:r>
         <w:t xml:space="preserve"> </w:t>
       </w:r>
       <w:r>
-        <w:t xml:space="preserve">TypeScript, JavaScript, Python, Go</w:t>
+        <w:t xml:space="preserve">— Native speaker</w:t>
       </w:r>
     </w:p>
     <w:p>
@@ -230,104 +610,16 @@
           <w:b/>
           <w:bCs/>
         </w:rPr>
-        <w:t xml:space="preserve">Frontend:</w:t>
+        <w:t xml:space="preserve">English</w:t>
       </w:r>
       <w:r>
         <w:t xml:space="preserve"> </w:t>
       </w:r>
       <w:r>
-        <w:t xml:space="preserve">React, SolidJS, Astro, HTML/CSS</w:t>
-      </w:r>
-    </w:p>
-    <w:p>
-      <w:pPr>
-        <w:pStyle w:val="Compact"/>
-        <w:numPr>
-          <w:ilvl w:val="0"/>
-          <w:numId w:val="1003"/>
-        </w:numPr>
-      </w:pPr>
-      <w:r>
-        <w:rPr>
-          <w:b/>
-          <w:bCs/>
-        </w:rPr>
-        <w:t xml:space="preserve">Backend:</w:t>
-      </w:r>
-      <w:r>
-        <w:t xml:space="preserve"> </w:t>
-      </w:r>
-      <w:r>
-        <w:t xml:space="preserve">Node.js, Fastify, Express</w:t>
-      </w:r>
-    </w:p>
-    <w:p>
-      <w:pPr>
-        <w:pStyle w:val="Compact"/>
-        <w:numPr>
-          <w:ilvl w:val="0"/>
-          <w:numId w:val="1003"/>
-        </w:numPr>
-      </w:pPr>
-      <w:r>
-        <w:rPr>
-          <w:b/>
-          <w:bCs/>
-        </w:rPr>
-        <w:t xml:space="preserve">Databases:</w:t>
-      </w:r>
-      <w:r>
-        <w:t xml:space="preserve"> </w:t>
-      </w:r>
-      <w:r>
-        <w:t xml:space="preserve">PostgreSQL, Redis, MongoDB</w:t>
-      </w:r>
-    </w:p>
-    <w:p>
-      <w:pPr>
-        <w:pStyle w:val="Compact"/>
-        <w:numPr>
-          <w:ilvl w:val="0"/>
-          <w:numId w:val="1003"/>
-        </w:numPr>
-      </w:pPr>
-      <w:r>
-        <w:rPr>
-          <w:b/>
-          <w:bCs/>
-        </w:rPr>
-        <w:t xml:space="preserve">DevOps:</w:t>
-      </w:r>
-      <w:r>
-        <w:t xml:space="preserve"> </w:t>
-      </w:r>
-      <w:r>
-        <w:t xml:space="preserve">Docker, Kubernetes, CI/CD, AWS</w:t>
-      </w:r>
-    </w:p>
-    <w:p>
-      <w:pPr>
-        <w:pStyle w:val="Compact"/>
-        <w:numPr>
-          <w:ilvl w:val="0"/>
-          <w:numId w:val="1003"/>
-        </w:numPr>
-      </w:pPr>
-      <w:r>
-        <w:rPr>
-          <w:b/>
-          <w:bCs/>
-        </w:rPr>
-        <w:t xml:space="preserve">Tools:</w:t>
-      </w:r>
-      <w:r>
-        <w:t xml:space="preserve"> </w:t>
-      </w:r>
-      <w:r>
-        <w:t xml:space="preserve">Git, Linux, Vim</w:t>
-      </w:r>
-    </w:p>
-    <w:bookmarkEnd w:id="15"/>
+        <w:t xml:space="preserve">— Advanced</w:t>
+      </w:r>
+    </w:p>
+    <w:bookmarkEnd w:id="19"/>
     <w:sectPr>
       <w:footnotePr>
         <w:numRestart w:val="eachSect"/>

</xml_diff>

<commit_message>
content: add skills (Astro, Tailwind, Fastify, CI/CD, AI tools), update DataArt experience
</commit_message>
<xml_diff>
--- a/public/downloads/cv.docx
+++ b/public/downloads/cv.docx
@@ -177,6 +177,30 @@
         </w:numPr>
       </w:pPr>
       <w:r>
+        <w:t xml:space="preserve">Created custom Webpack plugins from scratch to address project-specific build requirements</w:t>
+      </w:r>
+    </w:p>
+    <w:p>
+      <w:pPr>
+        <w:pStyle w:val="Compact"/>
+        <w:numPr>
+          <w:ilvl w:val="0"/>
+          <w:numId w:val="1001"/>
+        </w:numPr>
+      </w:pPr>
+      <w:r>
+        <w:t xml:space="preserve">Participated in developing an e-commerce application with Astro and headless WooCommerce</w:t>
+      </w:r>
+    </w:p>
+    <w:p>
+      <w:pPr>
+        <w:pStyle w:val="Compact"/>
+        <w:numPr>
+          <w:ilvl w:val="0"/>
+          <w:numId w:val="1001"/>
+        </w:numPr>
+      </w:pPr>
+      <w:r>
         <w:t xml:space="preserve">Helped my colleagues with preparation for client interviews</w:t>
       </w:r>
     </w:p>
@@ -364,7 +388,7 @@
         <w:t xml:space="preserve"> </w:t>
       </w:r>
       <w:r>
-        <w:t xml:space="preserve">React, Next.js, HTML &amp; CSS, SCSS, CSS-in-JS</w:t>
+        <w:t xml:space="preserve">React, Next.js, Astro, HTML &amp; CSS, SCSS, CSS-in-JS, Tailwind</w:t>
       </w:r>
     </w:p>
     <w:p>
@@ -408,7 +432,7 @@
         <w:t xml:space="preserve"> </w:t>
       </w:r>
       <w:r>
-        <w:t xml:space="preserve">Node.js, REST API</w:t>
+        <w:t xml:space="preserve">Node.js, Fastify, REST API</w:t>
       </w:r>
     </w:p>
     <w:p>
@@ -556,13 +580,57 @@
           <w:b/>
           <w:bCs/>
         </w:rPr>
-        <w:t xml:space="preserve">Version Control:</w:t>
+        <w:t xml:space="preserve">Performance &amp; Accessibility:</w:t>
       </w:r>
       <w:r>
         <w:t xml:space="preserve"> </w:t>
       </w:r>
       <w:r>
-        <w:t xml:space="preserve">Git</w:t>
+        <w:t xml:space="preserve">Web Performance, Web Accessibility</w:t>
+      </w:r>
+    </w:p>
+    <w:p>
+      <w:pPr>
+        <w:pStyle w:val="Compact"/>
+        <w:numPr>
+          <w:ilvl w:val="0"/>
+          <w:numId w:val="1002"/>
+        </w:numPr>
+      </w:pPr>
+      <w:r>
+        <w:rPr>
+          <w:b/>
+          <w:bCs/>
+        </w:rPr>
+        <w:t xml:space="preserve">DevOps &amp; CI/CD:</w:t>
+      </w:r>
+      <w:r>
+        <w:t xml:space="preserve"> </w:t>
+      </w:r>
+      <w:r>
+        <w:t xml:space="preserve">Git, GitHub Actions, GitLab CI/CD</w:t>
+      </w:r>
+    </w:p>
+    <w:p>
+      <w:pPr>
+        <w:pStyle w:val="Compact"/>
+        <w:numPr>
+          <w:ilvl w:val="0"/>
+          <w:numId w:val="1002"/>
+        </w:numPr>
+      </w:pPr>
+      <w:r>
+        <w:rPr>
+          <w:b/>
+          <w:bCs/>
+        </w:rPr>
+        <w:t xml:space="preserve">AI Tools:</w:t>
+      </w:r>
+      <w:r>
+        <w:t xml:space="preserve"> </w:t>
+      </w:r>
+      <w:r>
+        <w:t xml:space="preserve">Codex, Claude</w:t>
       </w:r>
     </w:p>
     <w:bookmarkEnd w:id="18"/>

</xml_diff>

<commit_message>
content: add SolidJS, gRPC (ConnectRPC) to skills
</commit_message>
<xml_diff>
--- a/public/downloads/cv.docx
+++ b/public/downloads/cv.docx
@@ -388,7 +388,7 @@
         <w:t xml:space="preserve"> </w:t>
       </w:r>
       <w:r>
-        <w:t xml:space="preserve">React, Next.js, Astro, HTML &amp; CSS, SCSS, CSS-in-JS, Tailwind</w:t>
+        <w:t xml:space="preserve">React, Next.js, Astro, SolidJS, HTML &amp; CSS, SCSS, CSS-in-JS, Tailwind</w:t>
       </w:r>
     </w:p>
     <w:p>
@@ -432,7 +432,7 @@
         <w:t xml:space="preserve"> </w:t>
       </w:r>
       <w:r>
-        <w:t xml:space="preserve">Node.js, Fastify, REST API</w:t>
+        <w:t xml:space="preserve">Node.js, Fastify, REST API, gRPC (ConnectRPC)</w:t>
       </w:r>
     </w:p>
     <w:p>

</xml_diff>

<commit_message>
refactor: generate-cv reads MD files as source of truth, includes photo in PDF+DOCX
</commit_message>
<xml_diff>
--- a/public/downloads/cv.docx
+++ b/public/downloads/cv.docx
@@ -2,7 +2,62 @@
 <file path=word/document.xml><?xml version="1.0" encoding="utf-8"?>
 <w:document xmlns:w="http://schemas.openxmlformats.org/wordprocessingml/2006/main" xmlns:m="http://schemas.openxmlformats.org/officeDocument/2006/math" xmlns:r="http://schemas.openxmlformats.org/officeDocument/2006/relationships" xmlns:o="urn:schemas-microsoft-com:office:office" xmlns:v="urn:schemas-microsoft-com:vml" xmlns:w10="urn:schemas-microsoft-com:office:word" xmlns:a="http://schemas.openxmlformats.org/drawingml/2006/main" xmlns:pic="http://schemas.openxmlformats.org/drawingml/2006/picture" xmlns:wp="http://schemas.openxmlformats.org/drawingml/2006/wordprocessingDrawing">
   <w:body>
-    <w:bookmarkStart w:id="9" w:name="dmytro-lesyk"/>
+    <w:p>
+      <w:pPr>
+        <w:pStyle w:val="CaptionedFigure"/>
+      </w:pPr>
+      <w:r>
+        <w:drawing>
+          <wp:inline>
+            <wp:extent cx="762000" cy="1016000"/>
+            <wp:effectExtent b="0" l="0" r="0" t="0"/>
+            <wp:docPr descr="Dmytro Lesyk" title="" id="10" name="Picture"/>
+            <a:graphic>
+              <a:graphicData uri="http://schemas.openxmlformats.org/drawingml/2006/picture">
+                <pic:pic>
+                  <pic:nvPicPr>
+                    <pic:cNvPr descr="/Users/dmytrolesyk/dev/cv/public/images/photo.jpg" id="11" name="Picture"/>
+                    <pic:cNvPicPr>
+                      <a:picLocks noChangeArrowheads="1" noChangeAspect="1"/>
+                    </pic:cNvPicPr>
+                  </pic:nvPicPr>
+                  <pic:blipFill>
+                    <a:blip r:embed="rId9"/>
+                    <a:stretch>
+                      <a:fillRect/>
+                    </a:stretch>
+                  </pic:blipFill>
+                  <pic:spPr bwMode="auto">
+                    <a:xfrm>
+                      <a:off x="0" y="0"/>
+                      <a:ext cx="762000" cy="1016000"/>
+                    </a:xfrm>
+                    <a:prstGeom prst="rect">
+                      <a:avLst/>
+                    </a:prstGeom>
+                    <a:noFill/>
+                    <a:ln w="9525">
+                      <a:noFill/>
+                      <a:headEnd/>
+                      <a:tailEnd/>
+                    </a:ln>
+                  </pic:spPr>
+                </pic:pic>
+              </a:graphicData>
+            </a:graphic>
+          </wp:inline>
+        </w:drawing>
+      </w:r>
+    </w:p>
+    <w:p>
+      <w:pPr>
+        <w:pStyle w:val="ImageCaption"/>
+      </w:pPr>
+      <w:r>
+        <w:t xml:space="preserve">Dmytro Lesyk</w:t>
+      </w:r>
+    </w:p>
+    <w:bookmarkStart w:id="12" w:name="dmytro-lesyk"/>
     <w:p>
       <w:pPr>
         <w:pStyle w:val="Heading2"/>
@@ -61,8 +116,8 @@
         <w:t xml:space="preserve">Looking forward to working with passionate and creative folks.</w:t>
       </w:r>
     </w:p>
-    <w:bookmarkEnd w:id="9"/>
-    <w:bookmarkStart w:id="13" w:name="employment-history"/>
+    <w:bookmarkEnd w:id="12"/>
+    <w:bookmarkStart w:id="16" w:name="employment-history"/>
     <w:p>
       <w:pPr>
         <w:pStyle w:val="Heading2"/>
@@ -71,7 +126,7 @@
         <w:t xml:space="preserve">Employment History</w:t>
       </w:r>
     </w:p>
-    <w:bookmarkStart w:id="10" w:name="frontend-engineer-dataart"/>
+    <w:bookmarkStart w:id="13" w:name="frontend-engineer-dataart"/>
     <w:p>
       <w:pPr>
         <w:pStyle w:val="Heading3"/>
@@ -204,8 +259,8 @@
         <w:t xml:space="preserve">Helped my colleagues with preparation for client interviews</w:t>
       </w:r>
     </w:p>
-    <w:bookmarkEnd w:id="10"/>
-    <w:bookmarkStart w:id="11" w:name="customer-support-specialist-cloudbeds"/>
+    <w:bookmarkEnd w:id="13"/>
+    <w:bookmarkStart w:id="14" w:name="customer-support-specialist-cloudbeds"/>
     <w:p>
       <w:pPr>
         <w:pStyle w:val="Heading3"/>
@@ -234,8 +289,8 @@
         <w:t xml:space="preserve">Cloudbeds is a software company building hospitality management solutions. My role there was to provide customer support to users over phone calls and email correspondence.</w:t>
       </w:r>
     </w:p>
-    <w:bookmarkEnd w:id="11"/>
-    <w:bookmarkStart w:id="12" w:name="customer-support-specialist-namecheap"/>
+    <w:bookmarkEnd w:id="14"/>
+    <w:bookmarkStart w:id="15" w:name="customer-support-specialist-namecheap"/>
     <w:p>
       <w:pPr>
         <w:pStyle w:val="Heading3"/>
@@ -264,9 +319,9 @@
         <w:t xml:space="preserve">Namecheap is an American ICANN-accredited domain name registrar and web hosting company. My job there was to provide top-notch customer support over chats, email correspondence and phone calls to clients all over the world.</w:t>
       </w:r>
     </w:p>
-    <w:bookmarkEnd w:id="12"/>
-    <w:bookmarkEnd w:id="13"/>
-    <w:bookmarkStart w:id="15" w:name="education"/>
+    <w:bookmarkEnd w:id="15"/>
+    <w:bookmarkEnd w:id="16"/>
+    <w:bookmarkStart w:id="18" w:name="education"/>
     <w:p>
       <w:pPr>
         <w:pStyle w:val="Heading2"/>
@@ -275,7 +330,7 @@
         <w:t xml:space="preserve">Education</w:t>
       </w:r>
     </w:p>
-    <w:bookmarkStart w:id="14" w:name="Xd23a71c5b66bafc286a57045e13c8548312ea6e"/>
+    <w:bookmarkStart w:id="17" w:name="Xd23a71c5b66bafc286a57045e13c8548312ea6e"/>
     <w:p>
       <w:pPr>
         <w:pStyle w:val="Heading3"/>
@@ -304,9 +359,9 @@
         <w:t xml:space="preserve">Faculty of Foreign Languages</w:t>
       </w:r>
     </w:p>
-    <w:bookmarkEnd w:id="14"/>
-    <w:bookmarkEnd w:id="15"/>
-    <w:bookmarkStart w:id="17" w:name="courses"/>
+    <w:bookmarkEnd w:id="17"/>
+    <w:bookmarkEnd w:id="18"/>
+    <w:bookmarkStart w:id="20" w:name="courses"/>
     <w:p>
       <w:pPr>
         <w:pStyle w:val="Heading2"/>
@@ -315,7 +370,7 @@
         <w:t xml:space="preserve">Courses</w:t>
       </w:r>
     </w:p>
-    <w:bookmarkStart w:id="16" w:name="algorithms-projector"/>
+    <w:bookmarkStart w:id="19" w:name="algorithms-projector"/>
     <w:p>
       <w:pPr>
         <w:pStyle w:val="Heading3"/>
@@ -336,9 +391,9 @@
         <w:t xml:space="preserve">March 2022 — June 2022</w:t>
       </w:r>
     </w:p>
-    <w:bookmarkEnd w:id="16"/>
-    <w:bookmarkEnd w:id="17"/>
-    <w:bookmarkStart w:id="18" w:name="technical-skills"/>
+    <w:bookmarkEnd w:id="19"/>
+    <w:bookmarkEnd w:id="20"/>
+    <w:bookmarkStart w:id="21" w:name="technical-skills"/>
     <w:p>
       <w:pPr>
         <w:pStyle w:val="Heading2"/>
@@ -633,8 +688,8 @@
         <w:t xml:space="preserve">Codex, Claude</w:t>
       </w:r>
     </w:p>
-    <w:bookmarkEnd w:id="18"/>
-    <w:bookmarkStart w:id="19" w:name="languages"/>
+    <w:bookmarkEnd w:id="21"/>
+    <w:bookmarkStart w:id="22" w:name="languages"/>
     <w:p>
       <w:pPr>
         <w:pStyle w:val="Heading2"/>
@@ -687,7 +742,7 @@
         <w:t xml:space="preserve">— Advanced</w:t>
       </w:r>
     </w:p>
-    <w:bookmarkEnd w:id="19"/>
+    <w:bookmarkEnd w:id="22"/>
     <w:sectPr>
       <w:footnotePr>
         <w:numRestart w:val="eachSect"/>

</xml_diff>

<commit_message>
content: add certificates (Genesis, AWS), contact info in all CV versions, Vite + cloud skills
</commit_message>
<xml_diff>
--- a/public/downloads/cv.docx
+++ b/public/downloads/cv.docx
@@ -57,7 +57,7 @@
         <w:t xml:space="preserve">Dmytro Lesyk</w:t>
       </w:r>
     </w:p>
-    <w:bookmarkStart w:id="12" w:name="dmytro-lesyk"/>
+    <w:bookmarkStart w:id="14" w:name="dmytro-lesyk"/>
     <w:p>
       <w:pPr>
         <w:pStyle w:val="Heading2"/>
@@ -89,6 +89,42 @@
         <w:pStyle w:val="BodyText"/>
       </w:pPr>
       <w:r>
+        <w:t xml:space="preserve">dmitriylesik@gmail.com ·</w:t>
+      </w:r>
+      <w:r>
+        <w:t xml:space="preserve"> </w:t>
+      </w:r>
+      <w:hyperlink r:id="rId12">
+        <w:r>
+          <w:rPr>
+            <w:rStyle w:val="Hyperlink"/>
+          </w:rPr>
+          <w:t xml:space="preserve">LinkedIn</w:t>
+        </w:r>
+      </w:hyperlink>
+      <w:r>
+        <w:t xml:space="preserve"> </w:t>
+      </w:r>
+      <w:r>
+        <w:t xml:space="preserve">·</w:t>
+      </w:r>
+      <w:r>
+        <w:t xml:space="preserve"> </w:t>
+      </w:r>
+      <w:hyperlink r:id="rId13">
+        <w:r>
+          <w:rPr>
+            <w:rStyle w:val="Hyperlink"/>
+          </w:rPr>
+          <w:t xml:space="preserve">Telegram</w:t>
+        </w:r>
+      </w:hyperlink>
+    </w:p>
+    <w:p>
+      <w:pPr>
+        <w:pStyle w:val="BodyText"/>
+      </w:pPr>
+      <w:r>
         <w:t xml:space="preserve">Self-taught software engineer who is passionate about Tech and coding. I enjoy making my life easier by optimizing and automating processes.</w:t>
       </w:r>
     </w:p>
@@ -116,8 +152,8 @@
         <w:t xml:space="preserve">Looking forward to working with passionate and creative folks.</w:t>
       </w:r>
     </w:p>
-    <w:bookmarkEnd w:id="12"/>
-    <w:bookmarkStart w:id="16" w:name="employment-history"/>
+    <w:bookmarkEnd w:id="14"/>
+    <w:bookmarkStart w:id="18" w:name="employment-history"/>
     <w:p>
       <w:pPr>
         <w:pStyle w:val="Heading2"/>
@@ -126,7 +162,7 @@
         <w:t xml:space="preserve">Employment History</w:t>
       </w:r>
     </w:p>
-    <w:bookmarkStart w:id="13" w:name="frontend-engineer-dataart"/>
+    <w:bookmarkStart w:id="15" w:name="frontend-engineer-dataart"/>
     <w:p>
       <w:pPr>
         <w:pStyle w:val="Heading3"/>
@@ -259,8 +295,8 @@
         <w:t xml:space="preserve">Helped my colleagues with preparation for client interviews</w:t>
       </w:r>
     </w:p>
-    <w:bookmarkEnd w:id="13"/>
-    <w:bookmarkStart w:id="14" w:name="customer-support-specialist-cloudbeds"/>
+    <w:bookmarkEnd w:id="15"/>
+    <w:bookmarkStart w:id="16" w:name="customer-support-specialist-cloudbeds"/>
     <w:p>
       <w:pPr>
         <w:pStyle w:val="Heading3"/>
@@ -289,8 +325,8 @@
         <w:t xml:space="preserve">Cloudbeds is a software company building hospitality management solutions. My role there was to provide customer support to users over phone calls and email correspondence.</w:t>
       </w:r>
     </w:p>
-    <w:bookmarkEnd w:id="14"/>
-    <w:bookmarkStart w:id="15" w:name="customer-support-specialist-namecheap"/>
+    <w:bookmarkEnd w:id="16"/>
+    <w:bookmarkStart w:id="17" w:name="customer-support-specialist-namecheap"/>
     <w:p>
       <w:pPr>
         <w:pStyle w:val="Heading3"/>
@@ -319,9 +355,9 @@
         <w:t xml:space="preserve">Namecheap is an American ICANN-accredited domain name registrar and web hosting company. My job there was to provide top-notch customer support over chats, email correspondence and phone calls to clients all over the world.</w:t>
       </w:r>
     </w:p>
-    <w:bookmarkEnd w:id="15"/>
-    <w:bookmarkEnd w:id="16"/>
-    <w:bookmarkStart w:id="18" w:name="education"/>
+    <w:bookmarkEnd w:id="17"/>
+    <w:bookmarkEnd w:id="18"/>
+    <w:bookmarkStart w:id="20" w:name="education"/>
     <w:p>
       <w:pPr>
         <w:pStyle w:val="Heading2"/>
@@ -330,7 +366,7 @@
         <w:t xml:space="preserve">Education</w:t>
       </w:r>
     </w:p>
-    <w:bookmarkStart w:id="17" w:name="Xd23a71c5b66bafc286a57045e13c8548312ea6e"/>
+    <w:bookmarkStart w:id="19" w:name="Xd23a71c5b66bafc286a57045e13c8548312ea6e"/>
     <w:p>
       <w:pPr>
         <w:pStyle w:val="Heading3"/>
@@ -359,9 +395,9 @@
         <w:t xml:space="preserve">Faculty of Foreign Languages</w:t>
       </w:r>
     </w:p>
-    <w:bookmarkEnd w:id="17"/>
-    <w:bookmarkEnd w:id="18"/>
-    <w:bookmarkStart w:id="20" w:name="courses"/>
+    <w:bookmarkEnd w:id="19"/>
+    <w:bookmarkEnd w:id="20"/>
+    <w:bookmarkStart w:id="22" w:name="courses"/>
     <w:p>
       <w:pPr>
         <w:pStyle w:val="Heading2"/>
@@ -370,7 +406,7 @@
         <w:t xml:space="preserve">Courses</w:t>
       </w:r>
     </w:p>
-    <w:bookmarkStart w:id="19" w:name="algorithms-projector"/>
+    <w:bookmarkStart w:id="21" w:name="algorithms-projector"/>
     <w:p>
       <w:pPr>
         <w:pStyle w:val="Heading3"/>
@@ -391,9 +427,79 @@
         <w:t xml:space="preserve">March 2022 — June 2022</w:t>
       </w:r>
     </w:p>
-    <w:bookmarkEnd w:id="19"/>
-    <w:bookmarkEnd w:id="20"/>
-    <w:bookmarkStart w:id="21" w:name="technical-skills"/>
+    <w:bookmarkEnd w:id="21"/>
+    <w:bookmarkEnd w:id="22"/>
+    <w:bookmarkStart w:id="25" w:name="certificates"/>
+    <w:p>
+      <w:pPr>
+        <w:pStyle w:val="Heading2"/>
+      </w:pPr>
+      <w:r>
+        <w:t xml:space="preserve">Certificates</w:t>
+      </w:r>
+    </w:p>
+    <w:bookmarkStart w:id="23" w:name="X9bad960053a69c3ba89505893aef0e238768e2c"/>
+    <w:p>
+      <w:pPr>
+        <w:pStyle w:val="Heading3"/>
+      </w:pPr>
+      <w:r>
+        <w:t xml:space="preserve">Genesis Front-End School 3.0 — Genesis Academy</w:t>
+      </w:r>
+    </w:p>
+    <w:p>
+      <w:pPr>
+        <w:pStyle w:val="FirstParagraph"/>
+      </w:pPr>
+      <w:r>
+        <w:rPr>
+          <w:i/>
+          <w:iCs/>
+        </w:rPr>
+        <w:t xml:space="preserve">July 2025</w:t>
+      </w:r>
+    </w:p>
+    <w:p>
+      <w:pPr>
+        <w:pStyle w:val="BodyText"/>
+      </w:pPr>
+      <w:r>
+        <w:t xml:space="preserve">3-month intensive frontend engineering program.</w:t>
+      </w:r>
+    </w:p>
+    <w:bookmarkEnd w:id="23"/>
+    <w:bookmarkStart w:id="24" w:name="Xe8d0447b11e2e7fc975840dc220eecea7f518d6"/>
+    <w:p>
+      <w:pPr>
+        <w:pStyle w:val="Heading3"/>
+      </w:pPr>
+      <w:r>
+        <w:t xml:space="preserve">AWS for Frontend Developers — fwdays academy</w:t>
+      </w:r>
+    </w:p>
+    <w:p>
+      <w:pPr>
+        <w:pStyle w:val="FirstParagraph"/>
+      </w:pPr>
+      <w:r>
+        <w:rPr>
+          <w:i/>
+          <w:iCs/>
+        </w:rPr>
+        <w:t xml:space="preserve">December 2025</w:t>
+      </w:r>
+    </w:p>
+    <w:p>
+      <w:pPr>
+        <w:pStyle w:val="BodyText"/>
+      </w:pPr>
+      <w:r>
+        <w:t xml:space="preserve">Crash course on AWS services for frontend developers (S3, CloudFront, Route 53).</w:t>
+      </w:r>
+    </w:p>
+    <w:bookmarkEnd w:id="24"/>
+    <w:bookmarkEnd w:id="25"/>
+    <w:bookmarkStart w:id="26" w:name="technical-skills"/>
     <w:p>
       <w:pPr>
         <w:pStyle w:val="Heading2"/>
@@ -553,7 +659,7 @@
         <w:t xml:space="preserve"> </w:t>
       </w:r>
       <w:r>
-        <w:t xml:space="preserve">Webpack</w:t>
+        <w:t xml:space="preserve">Webpack, Vite</w:t>
       </w:r>
     </w:p>
     <w:p>
@@ -679,31 +785,21 @@
           <w:b/>
           <w:bCs/>
         </w:rPr>
-        <w:t xml:space="preserve">AI Tools:</w:t>
+        <w:t xml:space="preserve">Cloud:</w:t>
       </w:r>
       <w:r>
         <w:t xml:space="preserve"> </w:t>
       </w:r>
       <w:r>
-        <w:t xml:space="preserve">Codex, Claude</w:t>
-      </w:r>
-    </w:p>
-    <w:bookmarkEnd w:id="21"/>
-    <w:bookmarkStart w:id="22" w:name="languages"/>
-    <w:p>
-      <w:pPr>
-        <w:pStyle w:val="Heading2"/>
-      </w:pPr>
-      <w:r>
-        <w:t xml:space="preserve">Languages</w:t>
-      </w:r>
-    </w:p>
-    <w:p>
-      <w:pPr>
-        <w:pStyle w:val="Compact"/>
-        <w:numPr>
-          <w:ilvl w:val="0"/>
-          <w:numId w:val="1003"/>
+        <w:t xml:space="preserve">AWS (S3, CloudFront, Route 53), Cloudflare</w:t>
+      </w:r>
+    </w:p>
+    <w:p>
+      <w:pPr>
+        <w:pStyle w:val="Compact"/>
+        <w:numPr>
+          <w:ilvl w:val="0"/>
+          <w:numId w:val="1002"/>
         </w:numPr>
       </w:pPr>
       <w:r>
@@ -711,13 +807,23 @@
           <w:b/>
           <w:bCs/>
         </w:rPr>
-        <w:t xml:space="preserve">Ukrainian</w:t>
+        <w:t xml:space="preserve">AI Tools:</w:t>
       </w:r>
       <w:r>
         <w:t xml:space="preserve"> </w:t>
       </w:r>
       <w:r>
-        <w:t xml:space="preserve">— Native speaker</w:t>
+        <w:t xml:space="preserve">Codex, Claude</w:t>
+      </w:r>
+    </w:p>
+    <w:bookmarkEnd w:id="26"/>
+    <w:bookmarkStart w:id="27" w:name="languages"/>
+    <w:p>
+      <w:pPr>
+        <w:pStyle w:val="Heading2"/>
+      </w:pPr>
+      <w:r>
+        <w:t xml:space="preserve">Languages</w:t>
       </w:r>
     </w:p>
     <w:p>
@@ -733,6 +839,28 @@
           <w:b/>
           <w:bCs/>
         </w:rPr>
+        <w:t xml:space="preserve">Ukrainian</w:t>
+      </w:r>
+      <w:r>
+        <w:t xml:space="preserve"> </w:t>
+      </w:r>
+      <w:r>
+        <w:t xml:space="preserve">— Native speaker</w:t>
+      </w:r>
+    </w:p>
+    <w:p>
+      <w:pPr>
+        <w:pStyle w:val="Compact"/>
+        <w:numPr>
+          <w:ilvl w:val="0"/>
+          <w:numId w:val="1003"/>
+        </w:numPr>
+      </w:pPr>
+      <w:r>
+        <w:rPr>
+          <w:b/>
+          <w:bCs/>
+        </w:rPr>
         <w:t xml:space="preserve">English</w:t>
       </w:r>
       <w:r>
@@ -742,7 +870,7 @@
         <w:t xml:space="preserve">— Advanced</w:t>
       </w:r>
     </w:p>
-    <w:bookmarkEnd w:id="22"/>
+    <w:bookmarkEnd w:id="27"/>
     <w:sectPr>
       <w:footnotePr>
         <w:numRestart w:val="eachSect"/>

</xml_diff>